<commit_message>
docs: update README and reports with WITNESS-2 published status + DOI
README: WITNESS-2 status → Published, DOI 10.5281/zenodo.21425381
README: WITNESS-2 section → added execution summary, verdicts table, harness fixes
WITNESS-2-report.html: regenerated with DOI in footer
WITNESS-2-report.md/docx/pdf: DOI-updated versions (10.5281/zenodo.21425381)
All WITNESS-2 artifacts now reflect published state.
</commit_message>
<xml_diff>
--- a/witness-2/results/WITNESS-2-report.docx
+++ b/witness-2/results/WITNESS-2-report.docx
@@ -2,7 +2,7 @@
 <file path=word/document.xml><?xml version="1.0" encoding="utf-8"?>
 <w:document xmlns:w="http://schemas.openxmlformats.org/wordprocessingml/2006/main" xmlns:m="http://schemas.openxmlformats.org/officeDocument/2006/math" xmlns:r="http://schemas.openxmlformats.org/officeDocument/2006/relationships" xmlns:o="urn:schemas-microsoft-com:office:office" xmlns:v="urn:schemas-microsoft-com:vml" xmlns:w10="urn:schemas-microsoft-com:office:word" xmlns:a="http://schemas.openxmlformats.org/drawingml/2006/main" xmlns:pic="http://schemas.openxmlformats.org/drawingml/2006/picture" xmlns:wp="http://schemas.openxmlformats.org/drawingml/2006/wordprocessingDrawing">
   <w:body>
-    <w:bookmarkStart w:id="36" w:name="witness-2-results-report"/>
+    <w:bookmarkStart w:id="37" w:name="witness-2-results-report"/>
     <w:p>
       <w:pPr>
         <w:pStyle w:val="Heading1"/>
@@ -105,9 +105,14 @@
       <w:r>
         <w:t xml:space="preserve"> </w:t>
       </w:r>
-      <w:r>
-        <w:t xml:space="preserve">(Zenodo deposit pending — see WITNESS-2 deposit)</w:t>
-      </w:r>
+      <w:hyperlink r:id="rId20">
+        <w:r>
+          <w:rPr>
+            <w:rStyle w:val="Hyperlink"/>
+          </w:rPr>
+          <w:t xml:space="preserve">10.5281/zenodo.21425381</w:t>
+        </w:r>
+      </w:hyperlink>
       <w:r>
         <w:br/>
       </w:r>
@@ -148,7 +153,7 @@
         </w:pict>
       </w:r>
     </w:p>
-    <w:bookmarkStart w:id="20" w:name="executive-summary"/>
+    <w:bookmarkStart w:id="21" w:name="executive-summary"/>
     <w:p>
       <w:pPr>
         <w:pStyle w:val="Heading2"/>
@@ -217,8 +222,8 @@
         </w:pict>
       </w:r>
     </w:p>
-    <w:bookmarkEnd w:id="20"/>
-    <w:bookmarkStart w:id="21" w:name="preregistration"/>
+    <w:bookmarkEnd w:id="21"/>
+    <w:bookmarkStart w:id="22" w:name="preregistration"/>
     <w:p>
       <w:pPr>
         <w:pStyle w:val="Heading2"/>
@@ -520,8 +525,8 @@
         </w:pict>
       </w:r>
     </w:p>
-    <w:bookmarkEnd w:id="21"/>
-    <w:bookmarkStart w:id="22" w:name="harness-fixes-disclosed-pre-execution"/>
+    <w:bookmarkEnd w:id="22"/>
+    <w:bookmarkStart w:id="23" w:name="harness-fixes-disclosed-pre-execution"/>
     <w:p>
       <w:pPr>
         <w:pStyle w:val="Heading2"/>
@@ -647,8 +652,8 @@
         </w:pict>
       </w:r>
     </w:p>
-    <w:bookmarkEnd w:id="22"/>
-    <w:bookmarkStart w:id="24" w:name="qpu-execution"/>
+    <w:bookmarkEnd w:id="23"/>
+    <w:bookmarkStart w:id="25" w:name="qpu-execution"/>
     <w:p>
       <w:pPr>
         <w:pStyle w:val="Heading2"/>
@@ -1024,7 +1029,7 @@
         </w:tc>
       </w:tr>
     </w:tbl>
-    <w:bookmarkStart w:id="23" w:name="backend-calibration-at-execution"/>
+    <w:bookmarkStart w:id="24" w:name="backend-calibration-at-execution"/>
     <w:p>
       <w:pPr>
         <w:pStyle w:val="Heading3"/>
@@ -1514,9 +1519,9 @@
         </w:pict>
       </w:r>
     </w:p>
-    <w:bookmarkEnd w:id="23"/>
     <w:bookmarkEnd w:id="24"/>
-    <w:bookmarkStart w:id="25" w:name="proofrecord"/>
+    <w:bookmarkEnd w:id="25"/>
+    <w:bookmarkStart w:id="26" w:name="proofrecord"/>
     <w:p>
       <w:pPr>
         <w:pStyle w:val="Heading2"/>
@@ -1936,8 +1941,8 @@
         </w:pict>
       </w:r>
     </w:p>
-    <w:bookmarkEnd w:id="25"/>
-    <w:bookmarkStart w:id="29" w:name="case-results"/>
+    <w:bookmarkEnd w:id="26"/>
+    <w:bookmarkStart w:id="30" w:name="case-results"/>
     <w:p>
       <w:pPr>
         <w:pStyle w:val="Heading2"/>
@@ -1946,7 +1951,7 @@
         <w:t xml:space="preserve">6. Case Results</w:t>
       </w:r>
     </w:p>
-    <w:bookmarkStart w:id="26" w:name="w2-c1-honest-end-to-end-verification"/>
+    <w:bookmarkStart w:id="27" w:name="w2-c1-honest-end-to-end-verification"/>
     <w:p>
       <w:pPr>
         <w:pStyle w:val="Heading3"/>
@@ -2266,8 +2271,8 @@
         </w:pict>
       </w:r>
     </w:p>
-    <w:bookmarkEnd w:id="26"/>
-    <w:bookmarkStart w:id="27" w:name="X434a8e2490c6ecf3bb8d111c39da4ea9e9b6068"/>
+    <w:bookmarkEnd w:id="27"/>
+    <w:bookmarkStart w:id="28" w:name="X434a8e2490c6ecf3bb8d111c39da4ea9e9b6068"/>
     <w:p>
       <w:pPr>
         <w:pStyle w:val="Heading3"/>
@@ -2569,8 +2574,8 @@
         </w:pict>
       </w:r>
     </w:p>
-    <w:bookmarkEnd w:id="27"/>
-    <w:bookmarkStart w:id="28" w:name="Xbcdaa9f95727521ef7ccd211b1ddb87e2cfae05"/>
+    <w:bookmarkEnd w:id="28"/>
+    <w:bookmarkStart w:id="29" w:name="Xbcdaa9f95727521ef7ccd211b1ddb87e2cfae05"/>
     <w:p>
       <w:pPr>
         <w:pStyle w:val="Heading3"/>
@@ -2819,9 +2824,9 @@
         </w:pict>
       </w:r>
     </w:p>
-    <w:bookmarkEnd w:id="28"/>
     <w:bookmarkEnd w:id="29"/>
-    <w:bookmarkStart w:id="30" w:name="integrity-summary"/>
+    <w:bookmarkEnd w:id="30"/>
+    <w:bookmarkStart w:id="31" w:name="integrity-summary"/>
     <w:p>
       <w:pPr>
         <w:pStyle w:val="Heading2"/>
@@ -3001,8 +3006,8 @@
         </w:pict>
       </w:r>
     </w:p>
-    <w:bookmarkEnd w:id="30"/>
-    <w:bookmarkStart w:id="31" w:name="artifacts"/>
+    <w:bookmarkEnd w:id="31"/>
+    <w:bookmarkStart w:id="32" w:name="artifacts"/>
     <w:p>
       <w:pPr>
         <w:pStyle w:val="Heading2"/>
@@ -3377,8 +3382,8 @@
         </w:pict>
       </w:r>
     </w:p>
-    <w:bookmarkEnd w:id="31"/>
-    <w:bookmarkStart w:id="32" w:name="scope-and-limitations"/>
+    <w:bookmarkEnd w:id="32"/>
+    <w:bookmarkStart w:id="33" w:name="scope-and-limitations"/>
     <w:p>
       <w:pPr>
         <w:pStyle w:val="Heading2"/>
@@ -3478,8 +3483,8 @@
         </w:pict>
       </w:r>
     </w:p>
-    <w:bookmarkEnd w:id="32"/>
-    <w:bookmarkStart w:id="35" w:name="witness-series-context"/>
+    <w:bookmarkEnd w:id="33"/>
+    <w:bookmarkStart w:id="36" w:name="witness-series-context"/>
     <w:p>
       <w:pPr>
         <w:pStyle w:val="Heading2"/>
@@ -3572,7 +3577,7 @@
               <w:pStyle w:val="Compact"/>
               <w:jc w:val="left"/>
             </w:pPr>
-            <w:hyperlink r:id="rId33">
+            <w:hyperlink r:id="rId34">
               <w:r>
                 <w:rPr>
                   <w:rStyle w:val="Hyperlink"/>
@@ -3604,20 +3609,25 @@
               <w:jc w:val="left"/>
             </w:pPr>
             <w:r>
-              <w:t xml:space="preserve">✅ Complete — Zenodo pending</w:t>
-            </w:r>
-          </w:p>
-        </w:tc>
-        <w:tc>
-          <w:tcPr/>
-          <w:p>
-            <w:pPr>
-              <w:pStyle w:val="Compact"/>
-              <w:jc w:val="left"/>
-            </w:pPr>
-            <w:r>
-              <w:t xml:space="preserve">(this deposit)</w:t>
-            </w:r>
+              <w:t xml:space="preserve">✅ Published</w:t>
+            </w:r>
+          </w:p>
+        </w:tc>
+        <w:tc>
+          <w:tcPr/>
+          <w:p>
+            <w:pPr>
+              <w:pStyle w:val="Compact"/>
+              <w:jc w:val="left"/>
+            </w:pPr>
+            <w:hyperlink r:id="rId20">
+              <w:r>
+                <w:rPr>
+                  <w:rStyle w:val="Hyperlink"/>
+                </w:rPr>
+                <w:t xml:space="preserve">10.5281/zenodo.21425381</w:t>
+              </w:r>
+            </w:hyperlink>
           </w:p>
         </w:tc>
       </w:tr>
@@ -3632,7 +3642,7 @@
       <w:r>
         <w:t xml:space="preserve"> </w:t>
       </w:r>
-      <w:hyperlink r:id="rId34">
+      <w:hyperlink r:id="rId35">
         <w:r>
           <w:rPr>
             <w:rStyle w:val="Hyperlink"/>
@@ -3670,8 +3680,8 @@
         <w:t xml:space="preserve">Remnant Fieldworks Inc. — To God be the glory.</w:t>
       </w:r>
     </w:p>
-    <w:bookmarkEnd w:id="35"/>
     <w:bookmarkEnd w:id="36"/>
+    <w:bookmarkEnd w:id="37"/>
     <w:sectPr/>
   </w:body>
 </w:document>

</xml_diff>

<commit_message>
fix(witness-2): correct DOI labeling — 21425381 is the published Preregistered Execution Record (version DOI), not merely a preregistration DOI; align with WITNESS-1 report convention
</commit_message>
<xml_diff>
--- a/witness-2/results/WITNESS-2-report.docx
+++ b/witness-2/results/WITNESS-2-report.docx
@@ -100,7 +100,23 @@
           <w:bCs/>
           <w:b/>
         </w:rPr>
-        <w:t xml:space="preserve">Preregistration DOI:</w:t>
+        <w:t xml:space="preserve">Zenodo published record (Preregistered Execution Record):</w:t>
+      </w:r>
+      <w:r>
+        <w:t xml:space="preserve"> </w:t>
+      </w:r>
+      <w:r>
+        <w:t xml:space="preserve">https://zenodo.org/records/21425381</w:t>
+      </w:r>
+      <w:r>
+        <w:br/>
+      </w:r>
+      <w:r>
+        <w:rPr>
+          <w:bCs/>
+          <w:b/>
+        </w:rPr>
+        <w:t xml:space="preserve">DOI (version):</w:t>
       </w:r>
       <w:r>
         <w:t xml:space="preserve"> </w:t>
@@ -121,7 +137,7 @@
           <w:bCs/>
           <w:b/>
         </w:rPr>
-        <w:t xml:space="preserve">WITNESS Series Concept DOI:</w:t>
+        <w:t xml:space="preserve">DOI (concept, WITNESS series):</w:t>
       </w:r>
       <w:r>
         <w:t xml:space="preserve"> </w:t>

</xml_diff>